<commit_message>
update report & references
</commit_message>
<xml_diff>
--- a/Project Report-Shavonne.docx
+++ b/Project Report-Shavonne.docx
@@ -69,8 +69,80 @@
           <w:sz w:val="21"/>
           <w:szCs w:val="21"/>
         </w:rPr>
-        <w:t xml:space="preserve"> Lim Jing Ning | A027761W | GitHub link:</w:t>
-      </w:r>
+        <w:t xml:space="preserve"> Lim Jing Ning | A02776</w:t>
+      </w:r>
+      <w:r>
+        <w:rPr>
+          <w:rFonts w:ascii="Calibri" w:hAnsi="Calibri" w:cs="Calibri"/>
+          <w:sz w:val="21"/>
+          <w:szCs w:val="21"/>
+        </w:rPr>
+        <w:t>5</w:t>
+      </w:r>
+      <w:r>
+        <w:rPr>
+          <w:rFonts w:ascii="Calibri" w:hAnsi="Calibri" w:cs="Calibri"/>
+          <w:sz w:val="21"/>
+          <w:szCs w:val="21"/>
+        </w:rPr>
+        <w:t>1W</w:t>
+      </w:r>
+    </w:p>
+    <w:p>
+      <w:pPr>
+        <w:spacing w:after="0" w:line="276" w:lineRule="auto"/>
+        <w:jc w:val="center"/>
+        <w:rPr>
+          <w:rFonts w:ascii="Calibri" w:hAnsi="Calibri" w:cs="Calibri"/>
+          <w:sz w:val="21"/>
+          <w:szCs w:val="21"/>
+        </w:rPr>
+      </w:pPr>
+      <w:r>
+        <w:rPr>
+          <w:rFonts w:ascii="Calibri" w:hAnsi="Calibri" w:cs="Calibri"/>
+          <w:sz w:val="21"/>
+          <w:szCs w:val="21"/>
+        </w:rPr>
+        <w:t>GitHub link:</w:t>
+      </w:r>
+      <w:r>
+        <w:rPr>
+          <w:rFonts w:ascii="Calibri" w:hAnsi="Calibri" w:cs="Calibri"/>
+          <w:sz w:val="21"/>
+          <w:szCs w:val="21"/>
+        </w:rPr>
+        <w:t xml:space="preserve"> </w:t>
+      </w:r>
+      <w:hyperlink r:id="rId8" w:history="1">
+        <w:r>
+          <w:rPr>
+            <w:rStyle w:val="Hyperlink"/>
+            <w:rFonts w:ascii="Calibri" w:hAnsi="Calibri" w:cs="Calibri"/>
+            <w:sz w:val="21"/>
+            <w:szCs w:val="21"/>
+          </w:rPr>
+          <w:t>https://github.com/aretotaco/Language-M</w:t>
+        </w:r>
+        <w:r>
+          <w:rPr>
+            <w:rStyle w:val="Hyperlink"/>
+            <w:rFonts w:ascii="Calibri" w:hAnsi="Calibri" w:cs="Calibri"/>
+            <w:sz w:val="21"/>
+            <w:szCs w:val="21"/>
+          </w:rPr>
+          <w:t>o</w:t>
+        </w:r>
+        <w:r>
+          <w:rPr>
+            <w:rStyle w:val="Hyperlink"/>
+            <w:rFonts w:ascii="Calibri" w:hAnsi="Calibri" w:cs="Calibri"/>
+            <w:sz w:val="21"/>
+            <w:szCs w:val="21"/>
+          </w:rPr>
+          <w:t>dels-Embeddings-and-Representations.git</w:t>
+        </w:r>
+      </w:hyperlink>
     </w:p>
     <w:p>
       <w:pPr>
@@ -1044,6 +1116,7 @@
                 <w:szCs w:val="17"/>
                 <w14:ligatures w14:val="none"/>
               </w:rPr>
+              <w:lastRenderedPageBreak/>
               <w:t>Model</w:t>
             </w:r>
           </w:p>
@@ -1573,7 +1646,6 @@
                 <w:szCs w:val="17"/>
                 <w14:ligatures w14:val="none"/>
               </w:rPr>
-              <w:lastRenderedPageBreak/>
               <w:t>RNN</w:t>
             </w:r>
           </w:p>
@@ -2327,7 +2399,7 @@
                     </pic:cNvPicPr>
                   </pic:nvPicPr>
                   <pic:blipFill>
-                    <a:blip r:embed="rId6"/>
+                    <a:blip r:embed="rId9"/>
                     <a:srcRect/>
                     <a:stretch>
                       <a:fillRect/>
@@ -3783,6 +3855,7 @@
                 <w:sz w:val="16"/>
                 <w:szCs w:val="16"/>
               </w:rPr>
+              <w:lastRenderedPageBreak/>
               <w:t>Transformer</w:t>
             </w:r>
           </w:p>
@@ -3964,7 +4037,6 @@
           <w:sz w:val="18"/>
           <w:szCs w:val="18"/>
         </w:rPr>
-        <w:lastRenderedPageBreak/>
         <w:t>Table 2.</w:t>
       </w:r>
       <w:r>
@@ -5686,6 +5758,7 @@
         <w:rPr>
           <w:noProof/>
         </w:rPr>
+        <w:lastRenderedPageBreak/>
         <w:drawing>
           <wp:inline distT="0" distB="0" distL="0" distR="0" wp14:anchorId="0FA9C550" wp14:editId="7F033638">
             <wp:extent cx="5120640" cy="1706880"/>
@@ -5704,7 +5777,7 @@
                     </pic:cNvPicPr>
                   </pic:nvPicPr>
                   <pic:blipFill>
-                    <a:blip r:embed="rId7"/>
+                    <a:blip r:embed="rId10"/>
                     <a:srcRect/>
                     <a:stretch>
                       <a:fillRect/>
@@ -5812,7 +5885,6 @@
                 <w:sz w:val="16"/>
                 <w:szCs w:val="16"/>
               </w:rPr>
-              <w:lastRenderedPageBreak/>
               <w:t>Word</w:t>
             </w:r>
           </w:p>
@@ -6954,6 +7026,7 @@
         </w:numPr>
       </w:pPr>
       <w:r>
+        <w:lastRenderedPageBreak/>
         <w:t>Classifier</w:t>
       </w:r>
     </w:p>
@@ -8196,7 +8269,6 @@
                 <w:sz w:val="17"/>
                 <w:szCs w:val="17"/>
               </w:rPr>
-              <w:lastRenderedPageBreak/>
               <w:t>LSTM-A (random), mean</w:t>
             </w:r>
           </w:p>
@@ -8968,7 +9040,7 @@
                     </pic:cNvPicPr>
                   </pic:nvPicPr>
                   <pic:blipFill>
-                    <a:blip r:embed="rId8"/>
+                    <a:blip r:embed="rId11"/>
                     <a:srcRect/>
                     <a:stretch>
                       <a:fillRect/>
@@ -9113,7 +9185,16 @@
           <w:sz w:val="20"/>
           <w:szCs w:val="20"/>
         </w:rPr>
-        <w:t xml:space="preserve"> is labelled World but predicted Sports, and a Nepal tourism blockade is labelled Business but predicted World. Others come from words of another topic, such as a track-and-field interview full of media terms that is predicted as Sci/Tech. A few have no clear cause, such as a US–Australia free-trade deadline predicted as Sports.</w:t>
+        <w:t xml:space="preserve"> is labelled World but predicted Sports, and a Nepal tourism blockade is labelled Business but predicted World. Others come from words of another topic, such as a track-and-field </w:t>
+      </w:r>
+      <w:r>
+        <w:rPr>
+          <w:rFonts w:ascii="Calibri" w:eastAsia="Calibri" w:hAnsi="Calibri" w:cs="Calibri"/>
+          <w:sz w:val="20"/>
+          <w:szCs w:val="20"/>
+        </w:rPr>
+        <w:lastRenderedPageBreak/>
+        <w:t>interview full of media terms that is predicted as Sci/Tech. A few have no clear cause, such as a US–Australia free-trade deadline predicted as Sports.</w:t>
       </w:r>
     </w:p>
     <w:p>
@@ -9298,7 +9379,6 @@
         <w:rPr>
           <w:rFonts w:ascii="Calibri" w:hAnsi="Calibri" w:cs="Calibri"/>
         </w:rPr>
-        <w:lastRenderedPageBreak/>
         <w:t>Conclusion, limitations and lessons</w:t>
       </w:r>
     </w:p>
@@ -9843,18 +9923,11 @@
         </w:numPr>
         <w:spacing w:after="50"/>
         <w:rPr>
-          <w:sz w:val="20"/>
-          <w:szCs w:val="20"/>
-        </w:rPr>
-      </w:pPr>
-      <w:r>
-        <w:rPr>
           <w:rFonts w:ascii="Calibri" w:eastAsia="Calibri" w:hAnsi="Calibri" w:cs="Calibri"/>
           <w:sz w:val="20"/>
           <w:szCs w:val="20"/>
         </w:rPr>
-        <w:t xml:space="preserve">Hochreiter, S., &amp; </w:t>
-      </w:r>
+      </w:pPr>
       <w:proofErr w:type="spellStart"/>
       <w:r>
         <w:rPr>
@@ -9862,7 +9935,7 @@
           <w:sz w:val="20"/>
           <w:szCs w:val="20"/>
         </w:rPr>
-        <w:t>Schmidhuber</w:t>
+        <w:t>Lhoest</w:t>
       </w:r>
       <w:proofErr w:type="spellEnd"/>
       <w:r>
@@ -9871,26 +9944,18 @@
           <w:sz w:val="20"/>
           <w:szCs w:val="20"/>
         </w:rPr>
-        <w:t xml:space="preserve">, J. (1997). Long short-term memory. </w:t>
-      </w:r>
-      <w:r>
-        <w:rPr>
-          <w:rFonts w:ascii="Calibri" w:eastAsia="Calibri" w:hAnsi="Calibri" w:cs="Calibri"/>
-          <w:i/>
-          <w:iCs/>
-          <w:sz w:val="20"/>
-          <w:szCs w:val="20"/>
-        </w:rPr>
-        <w:t>Neural Computation</w:t>
-      </w:r>
-      <w:r>
-        <w:rPr>
-          <w:rFonts w:ascii="Calibri" w:eastAsia="Calibri" w:hAnsi="Calibri" w:cs="Calibri"/>
-          <w:sz w:val="20"/>
-          <w:szCs w:val="20"/>
-        </w:rPr>
-        <w:t>, 9(8), 1735–1780.</w:t>
-      </w:r>
+        <w:t>, Q., et al. (2021). Datasets: A community library for natural language processing. In Proceedings of the 2021 Conference on Empirical Methods in Natural Language Processing: System Demonstrations (pp. 175–184). Association for Computational Linguistics. </w:t>
+      </w:r>
+      <w:hyperlink r:id="rId12" w:tgtFrame="_blank" w:history="1">
+        <w:r>
+          <w:rPr>
+            <w:rFonts w:ascii="Calibri" w:hAnsi="Calibri" w:cs="Calibri"/>
+            <w:sz w:val="20"/>
+            <w:szCs w:val="20"/>
+          </w:rPr>
+          <w:t>https://doi.org/10.18653/v1/2021.emnlp-demo.21</w:t>
+        </w:r>
+      </w:hyperlink>
     </w:p>
     <w:p>
       <w:pPr>
@@ -9901,6 +9966,7 @@
         </w:numPr>
         <w:spacing w:after="50"/>
         <w:rPr>
+          <w:rFonts w:ascii="Calibri" w:eastAsia="Calibri" w:hAnsi="Calibri" w:cs="Calibri"/>
           <w:sz w:val="20"/>
           <w:szCs w:val="20"/>
         </w:rPr>
@@ -9912,7 +9978,7 @@
           <w:sz w:val="20"/>
           <w:szCs w:val="20"/>
         </w:rPr>
-        <w:t>Lhoest</w:t>
+        <w:t>Merity</w:t>
       </w:r>
       <w:proofErr w:type="spellEnd"/>
       <w:r>
@@ -9921,26 +9987,18 @@
           <w:sz w:val="20"/>
           <w:szCs w:val="20"/>
         </w:rPr>
-        <w:t xml:space="preserve">, Q., et al. (2021). Datasets: A community library for natural language processing. </w:t>
-      </w:r>
-      <w:r>
-        <w:rPr>
-          <w:rFonts w:ascii="Calibri" w:eastAsia="Calibri" w:hAnsi="Calibri" w:cs="Calibri"/>
-          <w:i/>
-          <w:iCs/>
-          <w:sz w:val="20"/>
-          <w:szCs w:val="20"/>
-        </w:rPr>
-        <w:t>EMNLP 2021: System Demonstrations</w:t>
-      </w:r>
-      <w:r>
-        <w:rPr>
-          <w:rFonts w:ascii="Calibri" w:eastAsia="Calibri" w:hAnsi="Calibri" w:cs="Calibri"/>
-          <w:sz w:val="20"/>
-          <w:szCs w:val="20"/>
-        </w:rPr>
-        <w:t>.</w:t>
-      </w:r>
+        <w:t>, S., Xiong, C., Bradbury, J., &amp; Socher, R. (2017). Pointer sentinel mixture models. In International Conference on Learning Representations (ICLR 2017). </w:t>
+      </w:r>
+      <w:hyperlink r:id="rId13" w:tgtFrame="_blank" w:history="1">
+        <w:r>
+          <w:rPr>
+            <w:rFonts w:ascii="Calibri" w:hAnsi="Calibri" w:cs="Calibri"/>
+            <w:sz w:val="20"/>
+            <w:szCs w:val="20"/>
+          </w:rPr>
+          <w:t>https://arxiv.org/abs/1609.07843</w:t>
+        </w:r>
+      </w:hyperlink>
     </w:p>
     <w:p>
       <w:pPr>
@@ -9951,10 +10009,19 @@
         </w:numPr>
         <w:spacing w:after="50"/>
         <w:rPr>
-          <w:sz w:val="20"/>
-          <w:szCs w:val="20"/>
-        </w:rPr>
-      </w:pPr>
+          <w:rFonts w:ascii="Calibri" w:eastAsia="Calibri" w:hAnsi="Calibri" w:cs="Calibri"/>
+          <w:sz w:val="20"/>
+          <w:szCs w:val="20"/>
+        </w:rPr>
+      </w:pPr>
+      <w:r>
+        <w:rPr>
+          <w:rFonts w:ascii="Calibri" w:eastAsia="Calibri" w:hAnsi="Calibri" w:cs="Calibri"/>
+          <w:sz w:val="20"/>
+          <w:szCs w:val="20"/>
+        </w:rPr>
+        <w:t xml:space="preserve">Mikolov, T., Chen, K., Corrado, G., &amp; Dean, J. (2013). Efficient estimation of word representations in vector space. </w:t>
+      </w:r>
       <w:proofErr w:type="spellStart"/>
       <w:r>
         <w:rPr>
@@ -9962,7 +10029,7 @@
           <w:sz w:val="20"/>
           <w:szCs w:val="20"/>
         </w:rPr>
-        <w:t>Merity</w:t>
+        <w:t>arXiv</w:t>
       </w:r>
       <w:proofErr w:type="spellEnd"/>
       <w:r>
@@ -9971,8 +10038,18 @@
           <w:sz w:val="20"/>
           <w:szCs w:val="20"/>
         </w:rPr>
-        <w:t>, S., Xiong, C., Bradbury, J., &amp; Socher, R. (2016). Pointer sentinel mixture models. arXiv:1609.07843. (WikiText-2)</w:t>
-      </w:r>
+        <w:t xml:space="preserve"> preprint arXiv:1301.3781. </w:t>
+      </w:r>
+      <w:hyperlink r:id="rId14" w:tgtFrame="_blank" w:history="1">
+        <w:r>
+          <w:rPr>
+            <w:rFonts w:ascii="Calibri" w:hAnsi="Calibri" w:cs="Calibri"/>
+            <w:sz w:val="20"/>
+            <w:szCs w:val="20"/>
+          </w:rPr>
+          <w:t>https://arxiv.org/abs/1301.3781</w:t>
+        </w:r>
+      </w:hyperlink>
     </w:p>
     <w:p>
       <w:pPr>
@@ -9983,17 +10060,46 @@
         </w:numPr>
         <w:spacing w:after="50"/>
         <w:rPr>
-          <w:sz w:val="20"/>
-          <w:szCs w:val="20"/>
-        </w:rPr>
-      </w:pPr>
-      <w:r>
-        <w:rPr>
           <w:rFonts w:ascii="Calibri" w:eastAsia="Calibri" w:hAnsi="Calibri" w:cs="Calibri"/>
           <w:sz w:val="20"/>
           <w:szCs w:val="20"/>
         </w:rPr>
-        <w:t>Mikolov, T., Chen, K., Corrado, G., &amp; Dean, J. (2013). Efficient estimation of word representations in vector space. arXiv:1301.3781.</w:t>
+      </w:pPr>
+      <w:proofErr w:type="spellStart"/>
+      <w:r>
+        <w:rPr>
+          <w:rFonts w:ascii="Calibri" w:eastAsia="Calibri" w:hAnsi="Calibri" w:cs="Calibri"/>
+          <w:sz w:val="20"/>
+          <w:szCs w:val="20"/>
+        </w:rPr>
+        <w:t>Paszke</w:t>
+      </w:r>
+      <w:proofErr w:type="spellEnd"/>
+      <w:r>
+        <w:rPr>
+          <w:rFonts w:ascii="Calibri" w:eastAsia="Calibri" w:hAnsi="Calibri" w:cs="Calibri"/>
+          <w:sz w:val="20"/>
+          <w:szCs w:val="20"/>
+        </w:rPr>
+        <w:t xml:space="preserve">, A., et al. (2019). </w:t>
+      </w:r>
+      <w:proofErr w:type="spellStart"/>
+      <w:r>
+        <w:rPr>
+          <w:rFonts w:ascii="Calibri" w:eastAsia="Calibri" w:hAnsi="Calibri" w:cs="Calibri"/>
+          <w:sz w:val="20"/>
+          <w:szCs w:val="20"/>
+        </w:rPr>
+        <w:t>PyTorch</w:t>
+      </w:r>
+      <w:proofErr w:type="spellEnd"/>
+      <w:r>
+        <w:rPr>
+          <w:rFonts w:ascii="Calibri" w:eastAsia="Calibri" w:hAnsi="Calibri" w:cs="Calibri"/>
+          <w:sz w:val="20"/>
+          <w:szCs w:val="20"/>
+        </w:rPr>
+        <w:t>: An imperative style, high-performance deep learning library. In Advances in Neural Information Processing Systems, 32, 8024–8035.</w:t>
       </w:r>
     </w:p>
     <w:p>
@@ -10005,75 +10111,18 @@
         </w:numPr>
         <w:spacing w:after="50"/>
         <w:rPr>
-          <w:sz w:val="20"/>
-          <w:szCs w:val="20"/>
-        </w:rPr>
-      </w:pPr>
-      <w:proofErr w:type="spellStart"/>
-      <w:r>
-        <w:rPr>
           <w:rFonts w:ascii="Calibri" w:eastAsia="Calibri" w:hAnsi="Calibri" w:cs="Calibri"/>
           <w:sz w:val="20"/>
           <w:szCs w:val="20"/>
         </w:rPr>
-        <w:t>Paszke</w:t>
-      </w:r>
-      <w:proofErr w:type="spellEnd"/>
+      </w:pPr>
       <w:r>
         <w:rPr>
           <w:rFonts w:ascii="Calibri" w:eastAsia="Calibri" w:hAnsi="Calibri" w:cs="Calibri"/>
           <w:sz w:val="20"/>
           <w:szCs w:val="20"/>
         </w:rPr>
-        <w:t xml:space="preserve">, A., et al. (2019). </w:t>
-      </w:r>
-      <w:proofErr w:type="spellStart"/>
-      <w:r>
-        <w:rPr>
-          <w:rFonts w:ascii="Calibri" w:eastAsia="Calibri" w:hAnsi="Calibri" w:cs="Calibri"/>
-          <w:sz w:val="20"/>
-          <w:szCs w:val="20"/>
-        </w:rPr>
-        <w:t>PyTorch</w:t>
-      </w:r>
-      <w:proofErr w:type="spellEnd"/>
-      <w:r>
-        <w:rPr>
-          <w:rFonts w:ascii="Calibri" w:eastAsia="Calibri" w:hAnsi="Calibri" w:cs="Calibri"/>
-          <w:sz w:val="20"/>
-          <w:szCs w:val="20"/>
-        </w:rPr>
-        <w:t xml:space="preserve">: An imperative style, high-performance deep learning library. </w:t>
-      </w:r>
-      <w:proofErr w:type="spellStart"/>
-      <w:r>
-        <w:rPr>
-          <w:rFonts w:ascii="Calibri" w:eastAsia="Calibri" w:hAnsi="Calibri" w:cs="Calibri"/>
-          <w:i/>
-          <w:iCs/>
-          <w:sz w:val="20"/>
-          <w:szCs w:val="20"/>
-        </w:rPr>
-        <w:t>NeurIPS</w:t>
-      </w:r>
-      <w:proofErr w:type="spellEnd"/>
-      <w:r>
-        <w:rPr>
-          <w:rFonts w:ascii="Calibri" w:eastAsia="Calibri" w:hAnsi="Calibri" w:cs="Calibri"/>
-          <w:i/>
-          <w:iCs/>
-          <w:sz w:val="20"/>
-          <w:szCs w:val="20"/>
-        </w:rPr>
-        <w:t xml:space="preserve"> 2019</w:t>
-      </w:r>
-      <w:r>
-        <w:rPr>
-          <w:rFonts w:ascii="Calibri" w:eastAsia="Calibri" w:hAnsi="Calibri" w:cs="Calibri"/>
-          <w:sz w:val="20"/>
-          <w:szCs w:val="20"/>
-        </w:rPr>
-        <w:t>.</w:t>
+        <w:t>Pedregosa, F., et al. (2011). Scikit-learn: Machine learning in Python. Journal of Machine Learning Research, 12, 2825–2830.</w:t>
       </w:r>
     </w:p>
     <w:p>
@@ -10085,36 +10134,47 @@
         </w:numPr>
         <w:spacing w:after="50"/>
         <w:rPr>
-          <w:sz w:val="20"/>
-          <w:szCs w:val="20"/>
-        </w:rPr>
-      </w:pPr>
-      <w:r>
-        <w:rPr>
           <w:rFonts w:ascii="Calibri" w:eastAsia="Calibri" w:hAnsi="Calibri" w:cs="Calibri"/>
           <w:sz w:val="20"/>
           <w:szCs w:val="20"/>
         </w:rPr>
-        <w:t xml:space="preserve">Pedregosa, F., et al. (2011). Scikit-learn: Machine learning in Python. </w:t>
-      </w:r>
+      </w:pPr>
       <w:r>
         <w:rPr>
           <w:rFonts w:ascii="Calibri" w:eastAsia="Calibri" w:hAnsi="Calibri" w:cs="Calibri"/>
-          <w:i/>
-          <w:iCs/>
-          <w:sz w:val="20"/>
-          <w:szCs w:val="20"/>
-        </w:rPr>
-        <w:t>JMLR</w:t>
-      </w:r>
+          <w:sz w:val="20"/>
+          <w:szCs w:val="20"/>
+        </w:rPr>
+        <w:t xml:space="preserve">Pennington, J., Socher, R., &amp; Manning, C. D. (2014). </w:t>
+      </w:r>
+      <w:proofErr w:type="spellStart"/>
       <w:r>
         <w:rPr>
           <w:rFonts w:ascii="Calibri" w:eastAsia="Calibri" w:hAnsi="Calibri" w:cs="Calibri"/>
           <w:sz w:val="20"/>
           <w:szCs w:val="20"/>
         </w:rPr>
-        <w:t>, 12, 2825–2830.</w:t>
-      </w:r>
+        <w:t>GloVe</w:t>
+      </w:r>
+      <w:proofErr w:type="spellEnd"/>
+      <w:r>
+        <w:rPr>
+          <w:rFonts w:ascii="Calibri" w:eastAsia="Calibri" w:hAnsi="Calibri" w:cs="Calibri"/>
+          <w:sz w:val="20"/>
+          <w:szCs w:val="20"/>
+        </w:rPr>
+        <w:t>: Global vectors for word representation. In Proceedings of the 2014 Conference on Empirical Methods in Natural Language Processing (pp. 1532–1543). Association for Computational Linguistics. </w:t>
+      </w:r>
+      <w:hyperlink r:id="rId15" w:tgtFrame="_blank" w:history="1">
+        <w:r>
+          <w:rPr>
+            <w:rFonts w:ascii="Calibri" w:hAnsi="Calibri" w:cs="Calibri"/>
+            <w:sz w:val="20"/>
+            <w:szCs w:val="20"/>
+          </w:rPr>
+          <w:t>https://doi.org/10.3115/v1/D14-1162</w:t>
+        </w:r>
+      </w:hyperlink>
     </w:p>
     <w:p>
       <w:pPr>
@@ -10125,53 +10185,18 @@
         </w:numPr>
         <w:spacing w:after="50"/>
         <w:rPr>
-          <w:sz w:val="20"/>
-          <w:szCs w:val="20"/>
-        </w:rPr>
-      </w:pPr>
-      <w:r>
-        <w:rPr>
           <w:rFonts w:ascii="Calibri" w:eastAsia="Calibri" w:hAnsi="Calibri" w:cs="Calibri"/>
           <w:sz w:val="20"/>
           <w:szCs w:val="20"/>
         </w:rPr>
-        <w:t xml:space="preserve">Pennington, J., Socher, R., &amp; Manning, C. D. (2014). </w:t>
-      </w:r>
-      <w:proofErr w:type="spellStart"/>
+      </w:pPr>
       <w:r>
         <w:rPr>
           <w:rFonts w:ascii="Calibri" w:eastAsia="Calibri" w:hAnsi="Calibri" w:cs="Calibri"/>
           <w:sz w:val="20"/>
           <w:szCs w:val="20"/>
         </w:rPr>
-        <w:t>GloVe</w:t>
-      </w:r>
-      <w:proofErr w:type="spellEnd"/>
-      <w:r>
-        <w:rPr>
-          <w:rFonts w:ascii="Calibri" w:eastAsia="Calibri" w:hAnsi="Calibri" w:cs="Calibri"/>
-          <w:sz w:val="20"/>
-          <w:szCs w:val="20"/>
-        </w:rPr>
-        <w:t xml:space="preserve">: Global vectors for word representation. </w:t>
-      </w:r>
-      <w:r>
-        <w:rPr>
-          <w:rFonts w:ascii="Calibri" w:eastAsia="Calibri" w:hAnsi="Calibri" w:cs="Calibri"/>
-          <w:i/>
-          <w:iCs/>
-          <w:sz w:val="20"/>
-          <w:szCs w:val="20"/>
-        </w:rPr>
-        <w:t>EMNLP 2014</w:t>
-      </w:r>
-      <w:r>
-        <w:rPr>
-          <w:rFonts w:ascii="Calibri" w:eastAsia="Calibri" w:hAnsi="Calibri" w:cs="Calibri"/>
-          <w:sz w:val="20"/>
-          <w:szCs w:val="20"/>
-        </w:rPr>
-        <w:t>.</w:t>
+        <w:t>Vaswani, A., et al. (2017). Attention is all you need. In Advances in Neural Information Processing Systems, 30, 5998–6008.</w:t>
       </w:r>
     </w:p>
     <w:p>
@@ -10183,167 +10208,18 @@
         </w:numPr>
         <w:spacing w:after="50"/>
         <w:rPr>
-          <w:sz w:val="20"/>
-          <w:szCs w:val="20"/>
-        </w:rPr>
-      </w:pPr>
-      <w:proofErr w:type="spellStart"/>
-      <w:r>
-        <w:rPr>
           <w:rFonts w:ascii="Calibri" w:eastAsia="Calibri" w:hAnsi="Calibri" w:cs="Calibri"/>
           <w:sz w:val="20"/>
           <w:szCs w:val="20"/>
         </w:rPr>
-        <w:t>Řehůřek</w:t>
-      </w:r>
-      <w:proofErr w:type="spellEnd"/>
+      </w:pPr>
       <w:r>
         <w:rPr>
           <w:rFonts w:ascii="Calibri" w:eastAsia="Calibri" w:hAnsi="Calibri" w:cs="Calibri"/>
           <w:sz w:val="20"/>
           <w:szCs w:val="20"/>
         </w:rPr>
-        <w:t xml:space="preserve">, R., &amp; Sojka, P. (2010). Software framework for topic modelling with large corpora. </w:t>
-      </w:r>
-      <w:r>
-        <w:rPr>
-          <w:rFonts w:ascii="Calibri" w:eastAsia="Calibri" w:hAnsi="Calibri" w:cs="Calibri"/>
-          <w:i/>
-          <w:iCs/>
-          <w:sz w:val="20"/>
-          <w:szCs w:val="20"/>
-        </w:rPr>
-        <w:t>LREC 2010 Workshop on New Challenges for NLP Frameworks</w:t>
-      </w:r>
-      <w:r>
-        <w:rPr>
-          <w:rFonts w:ascii="Calibri" w:eastAsia="Calibri" w:hAnsi="Calibri" w:cs="Calibri"/>
-          <w:sz w:val="20"/>
-          <w:szCs w:val="20"/>
-        </w:rPr>
-        <w:t>. (</w:t>
-      </w:r>
-      <w:proofErr w:type="spellStart"/>
-      <w:r>
-        <w:rPr>
-          <w:rFonts w:ascii="Calibri" w:eastAsia="Calibri" w:hAnsi="Calibri" w:cs="Calibri"/>
-          <w:sz w:val="20"/>
-          <w:szCs w:val="20"/>
-        </w:rPr>
-        <w:t>gensim</w:t>
-      </w:r>
-      <w:proofErr w:type="spellEnd"/>
-      <w:r>
-        <w:rPr>
-          <w:rFonts w:ascii="Calibri" w:eastAsia="Calibri" w:hAnsi="Calibri" w:cs="Calibri"/>
-          <w:sz w:val="20"/>
-          <w:szCs w:val="20"/>
-        </w:rPr>
-        <w:t>)</w:t>
-      </w:r>
-    </w:p>
-    <w:p>
-      <w:pPr>
-        <w:pStyle w:val="ListParagraph"/>
-        <w:numPr>
-          <w:ilvl w:val="0"/>
-          <w:numId w:val="7"/>
-        </w:numPr>
-        <w:spacing w:after="50"/>
-        <w:rPr>
-          <w:sz w:val="20"/>
-          <w:szCs w:val="20"/>
-        </w:rPr>
-      </w:pPr>
-      <w:r>
-        <w:rPr>
-          <w:rFonts w:ascii="Calibri" w:eastAsia="Calibri" w:hAnsi="Calibri" w:cs="Calibri"/>
-          <w:sz w:val="20"/>
-          <w:szCs w:val="20"/>
-        </w:rPr>
-        <w:t xml:space="preserve">Vaswani, A., et al. (2017). Attention is all you need. </w:t>
-      </w:r>
-      <w:proofErr w:type="spellStart"/>
-      <w:r>
-        <w:rPr>
-          <w:rFonts w:ascii="Calibri" w:eastAsia="Calibri" w:hAnsi="Calibri" w:cs="Calibri"/>
-          <w:i/>
-          <w:iCs/>
-          <w:sz w:val="20"/>
-          <w:szCs w:val="20"/>
-        </w:rPr>
-        <w:t>NeurIPS</w:t>
-      </w:r>
-      <w:proofErr w:type="spellEnd"/>
-      <w:r>
-        <w:rPr>
-          <w:rFonts w:ascii="Calibri" w:eastAsia="Calibri" w:hAnsi="Calibri" w:cs="Calibri"/>
-          <w:i/>
-          <w:iCs/>
-          <w:sz w:val="20"/>
-          <w:szCs w:val="20"/>
-        </w:rPr>
-        <w:t xml:space="preserve"> 2017</w:t>
-      </w:r>
-      <w:r>
-        <w:rPr>
-          <w:rFonts w:ascii="Calibri" w:eastAsia="Calibri" w:hAnsi="Calibri" w:cs="Calibri"/>
-          <w:sz w:val="20"/>
-          <w:szCs w:val="20"/>
-        </w:rPr>
-        <w:t>.</w:t>
-      </w:r>
-    </w:p>
-    <w:p>
-      <w:pPr>
-        <w:pStyle w:val="ListParagraph"/>
-        <w:numPr>
-          <w:ilvl w:val="0"/>
-          <w:numId w:val="7"/>
-        </w:numPr>
-        <w:spacing w:after="50"/>
-        <w:rPr>
-          <w:sz w:val="20"/>
-          <w:szCs w:val="20"/>
-        </w:rPr>
-      </w:pPr>
-      <w:r>
-        <w:rPr>
-          <w:rFonts w:ascii="Calibri" w:eastAsia="Calibri" w:hAnsi="Calibri" w:cs="Calibri"/>
-          <w:sz w:val="20"/>
-          <w:szCs w:val="20"/>
-        </w:rPr>
-        <w:t xml:space="preserve">Zhang, X., Zhao, J., &amp; LeCun, Y. (2015). Character-level convolutional networks for text classification. </w:t>
-      </w:r>
-      <w:proofErr w:type="spellStart"/>
-      <w:r>
-        <w:rPr>
-          <w:rFonts w:ascii="Calibri" w:eastAsia="Calibri" w:hAnsi="Calibri" w:cs="Calibri"/>
-          <w:i/>
-          <w:iCs/>
-          <w:sz w:val="20"/>
-          <w:szCs w:val="20"/>
-        </w:rPr>
-        <w:t>NeurIPS</w:t>
-      </w:r>
-      <w:proofErr w:type="spellEnd"/>
-      <w:r>
-        <w:rPr>
-          <w:rFonts w:ascii="Calibri" w:eastAsia="Calibri" w:hAnsi="Calibri" w:cs="Calibri"/>
-          <w:i/>
-          <w:iCs/>
-          <w:sz w:val="20"/>
-          <w:szCs w:val="20"/>
-        </w:rPr>
-        <w:t xml:space="preserve"> 2015</w:t>
-      </w:r>
-      <w:r>
-        <w:rPr>
-          <w:rFonts w:ascii="Calibri" w:eastAsia="Calibri" w:hAnsi="Calibri" w:cs="Calibri"/>
-          <w:sz w:val="20"/>
-          <w:szCs w:val="20"/>
-        </w:rPr>
-        <w:t>. (AG News)</w:t>
+        <w:t>Zhang, X., Zhao, J., &amp; LeCun, Y. (2015). Character-level convolutional networks for text classification. In Advances in Neural Information Processing Systems, 28, 649–657.</w:t>
       </w:r>
     </w:p>
     <w:p/>
@@ -13016,6 +12892,7 @@
       </w:r>
     </w:p>
     <w:sectPr>
+      <w:footerReference w:type="default" r:id="rId16"/>
       <w:pgSz w:w="12240" w:h="15840"/>
       <w:pgMar w:top="1077" w:right="1077" w:bottom="1077" w:left="1077" w:header="709" w:footer="709" w:gutter="0"/>
       <w:cols w:space="708"/>
@@ -13023,6 +12900,131 @@
     </w:sectPr>
   </w:body>
 </w:document>
+</file>
+
+<file path=word/endnotes.xml><?xml version="1.0" encoding="utf-8"?>
+<w:endnotes xmlns:wpc="http://schemas.microsoft.com/office/word/2010/wordprocessingCanvas" xmlns:cx="http://schemas.microsoft.com/office/drawing/2014/chartex" xmlns:cx1="http://schemas.microsoft.com/office/drawing/2015/9/8/chartex" xmlns:cx2="http://schemas.microsoft.com/office/drawing/2015/10/21/chartex" xmlns:cx3="http://schemas.microsoft.com/office/drawing/2016/5/9/chartex" xmlns:cx4="http://schemas.microsoft.com/office/drawing/2016/5/10/chartex" xmlns:cx5="http://schemas.microsoft.com/office/drawing/2016/5/11/chartex" xmlns:cx6="http://schemas.microsoft.com/office/drawing/2016/5/12/chartex" xmlns:cx7="http://schemas.microsoft.com/office/drawing/2016/5/13/chartex" xmlns:cx8="http://schemas.microsoft.com/office/drawing/2016/5/14/chartex" xmlns:mc="http://schemas.openxmlformats.org/markup-compatibility/2006" xmlns:aink="http://schemas.microsoft.com/office/drawing/2016/ink" xmlns:am3d="http://schemas.microsoft.com/office/drawing/2017/model3d" xmlns:o="urn:schemas-microsoft-com:office:office" xmlns:oel="http://schemas.microsoft.com/office/2019/extlst" xmlns:r="http://schemas.openxmlformats.org/officeDocument/2006/relationships" xmlns:m="http://schemas.openxmlformats.org/officeDocument/2006/math" xmlns:v="urn:schemas-microsoft-com:vml" xmlns:wp14="http://schemas.microsoft.com/office/word/2010/wordprocessingDrawing" xmlns:wp="http://schemas.openxmlformats.org/drawingml/2006/wordprocessingDrawing" xmlns:w10="urn:schemas-microsoft-com:office:word" xmlns:w="http://schemas.openxmlformats.org/wordprocessingml/2006/main" xmlns:w14="http://schemas.microsoft.com/office/word/2010/wordml" xmlns:w15="http://schemas.microsoft.com/office/word/2012/wordml" xmlns:w16cex="http://schemas.microsoft.com/office/word/2018/wordml/cex" xmlns:w16cid="http://schemas.microsoft.com/office/word/2016/wordml/cid" xmlns:w16="http://schemas.microsoft.com/office/word/2018/wordml" xmlns:w16du="http://schemas.microsoft.com/office/word/2023/wordml/word16du" xmlns:w16sdtdh="http://schemas.microsoft.com/office/word/2020/wordml/sdtdatahash" xmlns:w16sdtfl="http://schemas.microsoft.com/office/word/2024/wordml/sdtformatlock" xmlns:w16se="http://schemas.microsoft.com/office/word/2015/wordml/symex" xmlns:wpg="http://schemas.microsoft.com/office/word/2010/wordprocessingGroup" xmlns:wpi="http://schemas.microsoft.com/office/word/2010/wordprocessingInk" xmlns:wne="http://schemas.microsoft.com/office/word/2006/wordml" xmlns:wps="http://schemas.microsoft.com/office/word/2010/wordprocessingShape" mc:Ignorable="w14 w15 w16se w16cid w16 w16cex w16sdtdh w16sdtfl w16du wp14">
+  <w:endnote w:type="separator" w:id="-1">
+    <w:p>
+      <w:pPr>
+        <w:spacing w:after="0" w:line="240" w:lineRule="auto"/>
+      </w:pPr>
+      <w:r>
+        <w:separator/>
+      </w:r>
+    </w:p>
+  </w:endnote>
+  <w:endnote w:type="continuationSeparator" w:id="0">
+    <w:p>
+      <w:pPr>
+        <w:spacing w:after="0" w:line="240" w:lineRule="auto"/>
+      </w:pPr>
+      <w:r>
+        <w:continuationSeparator/>
+      </w:r>
+    </w:p>
+  </w:endnote>
+</w:endnotes>
+</file>
+
+<file path=word/footer1.xml><?xml version="1.0" encoding="utf-8"?>
+<w:ftr xmlns:wpc="http://schemas.microsoft.com/office/word/2010/wordprocessingCanvas" xmlns:cx="http://schemas.microsoft.com/office/drawing/2014/chartex" xmlns:cx1="http://schemas.microsoft.com/office/drawing/2015/9/8/chartex" xmlns:cx2="http://schemas.microsoft.com/office/drawing/2015/10/21/chartex" xmlns:cx3="http://schemas.microsoft.com/office/drawing/2016/5/9/chartex" xmlns:cx4="http://schemas.microsoft.com/office/drawing/2016/5/10/chartex" xmlns:cx5="http://schemas.microsoft.com/office/drawing/2016/5/11/chartex" xmlns:cx6="http://schemas.microsoft.com/office/drawing/2016/5/12/chartex" xmlns:cx7="http://schemas.microsoft.com/office/drawing/2016/5/13/chartex" xmlns:cx8="http://schemas.microsoft.com/office/drawing/2016/5/14/chartex" xmlns:mc="http://schemas.openxmlformats.org/markup-compatibility/2006" xmlns:aink="http://schemas.microsoft.com/office/drawing/2016/ink" xmlns:am3d="http://schemas.microsoft.com/office/drawing/2017/model3d" xmlns:o="urn:schemas-microsoft-com:office:office" xmlns:oel="http://schemas.microsoft.com/office/2019/extlst" xmlns:r="http://schemas.openxmlformats.org/officeDocument/2006/relationships" xmlns:m="http://schemas.openxmlformats.org/officeDocument/2006/math" xmlns:v="urn:schemas-microsoft-com:vml" xmlns:wp14="http://schemas.microsoft.com/office/word/2010/wordprocessingDrawing" xmlns:wp="http://schemas.openxmlformats.org/drawingml/2006/wordprocessingDrawing" xmlns:w10="urn:schemas-microsoft-com:office:word" xmlns:w="http://schemas.openxmlformats.org/wordprocessingml/2006/main" xmlns:w14="http://schemas.microsoft.com/office/word/2010/wordml" xmlns:w15="http://schemas.microsoft.com/office/word/2012/wordml" xmlns:w16cex="http://schemas.microsoft.com/office/word/2018/wordml/cex" xmlns:w16cid="http://schemas.microsoft.com/office/word/2016/wordml/cid" xmlns:w16="http://schemas.microsoft.com/office/word/2018/wordml" xmlns:w16du="http://schemas.microsoft.com/office/word/2023/wordml/word16du" xmlns:w16sdtdh="http://schemas.microsoft.com/office/word/2020/wordml/sdtdatahash" xmlns:w16sdtfl="http://schemas.microsoft.com/office/word/2024/wordml/sdtformatlock" xmlns:w16se="http://schemas.microsoft.com/office/word/2015/wordml/symex" xmlns:wpg="http://schemas.microsoft.com/office/word/2010/wordprocessingGroup" xmlns:wpi="http://schemas.microsoft.com/office/word/2010/wordprocessingInk" xmlns:wne="http://schemas.microsoft.com/office/word/2006/wordml" xmlns:wps="http://schemas.microsoft.com/office/word/2010/wordprocessingShape" mc:Ignorable="w14 w15 w16se w16cid w16 w16cex w16sdtdh w16sdtfl w16du wp14">
+  <w:sdt>
+    <w:sdtPr>
+      <w:id w:val="-1163470871"/>
+      <w:docPartObj>
+        <w:docPartGallery w:val="Page Numbers (Bottom of Page)"/>
+        <w:docPartUnique/>
+      </w:docPartObj>
+    </w:sdtPr>
+    <w:sdtEndPr>
+      <w:rPr>
+        <w:noProof/>
+        <w:sz w:val="20"/>
+        <w:szCs w:val="20"/>
+      </w:rPr>
+    </w:sdtEndPr>
+    <w:sdtContent>
+      <w:p>
+        <w:pPr>
+          <w:pStyle w:val="Footer"/>
+          <w:jc w:val="right"/>
+          <w:rPr>
+            <w:sz w:val="20"/>
+            <w:szCs w:val="20"/>
+          </w:rPr>
+        </w:pPr>
+        <w:r>
+          <w:rPr>
+            <w:sz w:val="20"/>
+            <w:szCs w:val="20"/>
+          </w:rPr>
+          <w:fldChar w:fldCharType="begin"/>
+        </w:r>
+        <w:r>
+          <w:rPr>
+            <w:sz w:val="20"/>
+            <w:szCs w:val="20"/>
+          </w:rPr>
+          <w:instrText xml:space="preserve"> PAGE   \* MERGEFORMAT </w:instrText>
+        </w:r>
+        <w:r>
+          <w:rPr>
+            <w:sz w:val="20"/>
+            <w:szCs w:val="20"/>
+          </w:rPr>
+          <w:fldChar w:fldCharType="separate"/>
+        </w:r>
+        <w:r>
+          <w:rPr>
+            <w:noProof/>
+            <w:sz w:val="20"/>
+            <w:szCs w:val="20"/>
+          </w:rPr>
+          <w:t>2</w:t>
+        </w:r>
+        <w:r>
+          <w:rPr>
+            <w:noProof/>
+            <w:sz w:val="20"/>
+            <w:szCs w:val="20"/>
+          </w:rPr>
+          <w:fldChar w:fldCharType="end"/>
+        </w:r>
+      </w:p>
+    </w:sdtContent>
+  </w:sdt>
+  <w:p>
+    <w:pPr>
+      <w:pStyle w:val="Footer"/>
+    </w:pPr>
+  </w:p>
+</w:ftr>
+</file>
+
+<file path=word/footnotes.xml><?xml version="1.0" encoding="utf-8"?>
+<w:footnotes xmlns:wpc="http://schemas.microsoft.com/office/word/2010/wordprocessingCanvas" xmlns:cx="http://schemas.microsoft.com/office/drawing/2014/chartex" xmlns:cx1="http://schemas.microsoft.com/office/drawing/2015/9/8/chartex" xmlns:cx2="http://schemas.microsoft.com/office/drawing/2015/10/21/chartex" xmlns:cx3="http://schemas.microsoft.com/office/drawing/2016/5/9/chartex" xmlns:cx4="http://schemas.microsoft.com/office/drawing/2016/5/10/chartex" xmlns:cx5="http://schemas.microsoft.com/office/drawing/2016/5/11/chartex" xmlns:cx6="http://schemas.microsoft.com/office/drawing/2016/5/12/chartex" xmlns:cx7="http://schemas.microsoft.com/office/drawing/2016/5/13/chartex" xmlns:cx8="http://schemas.microsoft.com/office/drawing/2016/5/14/chartex" xmlns:mc="http://schemas.openxmlformats.org/markup-compatibility/2006" xmlns:aink="http://schemas.microsoft.com/office/drawing/2016/ink" xmlns:am3d="http://schemas.microsoft.com/office/drawing/2017/model3d" xmlns:o="urn:schemas-microsoft-com:office:office" xmlns:oel="http://schemas.microsoft.com/office/2019/extlst" xmlns:r="http://schemas.openxmlformats.org/officeDocument/2006/relationships" xmlns:m="http://schemas.openxmlformats.org/officeDocument/2006/math" xmlns:v="urn:schemas-microsoft-com:vml" xmlns:wp14="http://schemas.microsoft.com/office/word/2010/wordprocessingDrawing" xmlns:wp="http://schemas.openxmlformats.org/drawingml/2006/wordprocessingDrawing" xmlns:w10="urn:schemas-microsoft-com:office:word" xmlns:w="http://schemas.openxmlformats.org/wordprocessingml/2006/main" xmlns:w14="http://schemas.microsoft.com/office/word/2010/wordml" xmlns:w15="http://schemas.microsoft.com/office/word/2012/wordml" xmlns:w16cex="http://schemas.microsoft.com/office/word/2018/wordml/cex" xmlns:w16cid="http://schemas.microsoft.com/office/word/2016/wordml/cid" xmlns:w16="http://schemas.microsoft.com/office/word/2018/wordml" xmlns:w16du="http://schemas.microsoft.com/office/word/2023/wordml/word16du" xmlns:w16sdtdh="http://schemas.microsoft.com/office/word/2020/wordml/sdtdatahash" xmlns:w16sdtfl="http://schemas.microsoft.com/office/word/2024/wordml/sdtformatlock" xmlns:w16se="http://schemas.microsoft.com/office/word/2015/wordml/symex" xmlns:wpg="http://schemas.microsoft.com/office/word/2010/wordprocessingGroup" xmlns:wpi="http://schemas.microsoft.com/office/word/2010/wordprocessingInk" xmlns:wne="http://schemas.microsoft.com/office/word/2006/wordml" xmlns:wps="http://schemas.microsoft.com/office/word/2010/wordprocessingShape" mc:Ignorable="w14 w15 w16se w16cid w16 w16cex w16sdtdh w16sdtfl w16du wp14">
+  <w:footnote w:type="separator" w:id="-1">
+    <w:p>
+      <w:pPr>
+        <w:spacing w:after="0" w:line="240" w:lineRule="auto"/>
+      </w:pPr>
+      <w:r>
+        <w:separator/>
+      </w:r>
+    </w:p>
+  </w:footnote>
+  <w:footnote w:type="continuationSeparator" w:id="0">
+    <w:p>
+      <w:pPr>
+        <w:spacing w:after="0" w:line="240" w:lineRule="auto"/>
+      </w:pPr>
+      <w:r>
+        <w:continuationSeparator/>
+      </w:r>
+    </w:p>
+  </w:footnote>
+</w:footnotes>
 </file>
 
 <file path=word/numbering.xml><?xml version="1.0" encoding="utf-8"?>
@@ -13238,6 +13240,119 @@
     </w:lvl>
   </w:abstractNum>
   <w:abstractNum w:abstractNumId="2" w15:restartNumberingAfterBreak="0">
+    <w:nsid w:val="35930F37"/>
+    <w:multiLevelType w:val="multilevel"/>
+    <w:tmpl w:val="D7A6A316"/>
+    <w:lvl w:ilvl="0">
+      <w:start w:val="1"/>
+      <w:numFmt w:val="decimal"/>
+      <w:lvlText w:val="%1."/>
+      <w:lvlJc w:val="left"/>
+      <w:pPr>
+        <w:tabs>
+          <w:tab w:val="num" w:pos="720"/>
+        </w:tabs>
+        <w:ind w:left="720" w:hanging="360"/>
+      </w:pPr>
+    </w:lvl>
+    <w:lvl w:ilvl="1" w:tentative="1">
+      <w:start w:val="1"/>
+      <w:numFmt w:val="decimal"/>
+      <w:lvlText w:val="%2."/>
+      <w:lvlJc w:val="left"/>
+      <w:pPr>
+        <w:tabs>
+          <w:tab w:val="num" w:pos="1440"/>
+        </w:tabs>
+        <w:ind w:left="1440" w:hanging="360"/>
+      </w:pPr>
+    </w:lvl>
+    <w:lvl w:ilvl="2" w:tentative="1">
+      <w:start w:val="1"/>
+      <w:numFmt w:val="decimal"/>
+      <w:lvlText w:val="%3."/>
+      <w:lvlJc w:val="left"/>
+      <w:pPr>
+        <w:tabs>
+          <w:tab w:val="num" w:pos="2160"/>
+        </w:tabs>
+        <w:ind w:left="2160" w:hanging="360"/>
+      </w:pPr>
+    </w:lvl>
+    <w:lvl w:ilvl="3" w:tentative="1">
+      <w:start w:val="1"/>
+      <w:numFmt w:val="decimal"/>
+      <w:lvlText w:val="%4."/>
+      <w:lvlJc w:val="left"/>
+      <w:pPr>
+        <w:tabs>
+          <w:tab w:val="num" w:pos="2880"/>
+        </w:tabs>
+        <w:ind w:left="2880" w:hanging="360"/>
+      </w:pPr>
+    </w:lvl>
+    <w:lvl w:ilvl="4" w:tentative="1">
+      <w:start w:val="1"/>
+      <w:numFmt w:val="decimal"/>
+      <w:lvlText w:val="%5."/>
+      <w:lvlJc w:val="left"/>
+      <w:pPr>
+        <w:tabs>
+          <w:tab w:val="num" w:pos="3600"/>
+        </w:tabs>
+        <w:ind w:left="3600" w:hanging="360"/>
+      </w:pPr>
+    </w:lvl>
+    <w:lvl w:ilvl="5" w:tentative="1">
+      <w:start w:val="1"/>
+      <w:numFmt w:val="decimal"/>
+      <w:lvlText w:val="%6."/>
+      <w:lvlJc w:val="left"/>
+      <w:pPr>
+        <w:tabs>
+          <w:tab w:val="num" w:pos="4320"/>
+        </w:tabs>
+        <w:ind w:left="4320" w:hanging="360"/>
+      </w:pPr>
+    </w:lvl>
+    <w:lvl w:ilvl="6" w:tentative="1">
+      <w:start w:val="1"/>
+      <w:numFmt w:val="decimal"/>
+      <w:lvlText w:val="%7."/>
+      <w:lvlJc w:val="left"/>
+      <w:pPr>
+        <w:tabs>
+          <w:tab w:val="num" w:pos="5040"/>
+        </w:tabs>
+        <w:ind w:left="5040" w:hanging="360"/>
+      </w:pPr>
+    </w:lvl>
+    <w:lvl w:ilvl="7" w:tentative="1">
+      <w:start w:val="1"/>
+      <w:numFmt w:val="decimal"/>
+      <w:lvlText w:val="%8."/>
+      <w:lvlJc w:val="left"/>
+      <w:pPr>
+        <w:tabs>
+          <w:tab w:val="num" w:pos="5760"/>
+        </w:tabs>
+        <w:ind w:left="5760" w:hanging="360"/>
+      </w:pPr>
+    </w:lvl>
+    <w:lvl w:ilvl="8" w:tentative="1">
+      <w:start w:val="1"/>
+      <w:numFmt w:val="decimal"/>
+      <w:lvlText w:val="%9."/>
+      <w:lvlJc w:val="left"/>
+      <w:pPr>
+        <w:tabs>
+          <w:tab w:val="num" w:pos="6480"/>
+        </w:tabs>
+        <w:ind w:left="6480" w:hanging="360"/>
+      </w:pPr>
+    </w:lvl>
+  </w:abstractNum>
+  <w:abstractNum w:abstractNumId="3" w15:restartNumberingAfterBreak="0">
     <w:nsid w:val="3676786F"/>
     <w:multiLevelType w:val="multilevel"/>
     <w:tmpl w:val="0409001F"/>
@@ -13323,7 +13438,120 @@
       </w:pPr>
     </w:lvl>
   </w:abstractNum>
-  <w:abstractNum w:abstractNumId="3" w15:restartNumberingAfterBreak="0">
+  <w:abstractNum w:abstractNumId="4" w15:restartNumberingAfterBreak="0">
+    <w:nsid w:val="45674C12"/>
+    <w:multiLevelType w:val="multilevel"/>
+    <w:tmpl w:val="422E63FC"/>
+    <w:lvl w:ilvl="0">
+      <w:start w:val="1"/>
+      <w:numFmt w:val="decimal"/>
+      <w:lvlText w:val="%1."/>
+      <w:lvlJc w:val="left"/>
+      <w:pPr>
+        <w:tabs>
+          <w:tab w:val="num" w:pos="720"/>
+        </w:tabs>
+        <w:ind w:left="720" w:hanging="360"/>
+      </w:pPr>
+    </w:lvl>
+    <w:lvl w:ilvl="1" w:tentative="1">
+      <w:start w:val="1"/>
+      <w:numFmt w:val="decimal"/>
+      <w:lvlText w:val="%2."/>
+      <w:lvlJc w:val="left"/>
+      <w:pPr>
+        <w:tabs>
+          <w:tab w:val="num" w:pos="1440"/>
+        </w:tabs>
+        <w:ind w:left="1440" w:hanging="360"/>
+      </w:pPr>
+    </w:lvl>
+    <w:lvl w:ilvl="2" w:tentative="1">
+      <w:start w:val="1"/>
+      <w:numFmt w:val="decimal"/>
+      <w:lvlText w:val="%3."/>
+      <w:lvlJc w:val="left"/>
+      <w:pPr>
+        <w:tabs>
+          <w:tab w:val="num" w:pos="2160"/>
+        </w:tabs>
+        <w:ind w:left="2160" w:hanging="360"/>
+      </w:pPr>
+    </w:lvl>
+    <w:lvl w:ilvl="3" w:tentative="1">
+      <w:start w:val="1"/>
+      <w:numFmt w:val="decimal"/>
+      <w:lvlText w:val="%4."/>
+      <w:lvlJc w:val="left"/>
+      <w:pPr>
+        <w:tabs>
+          <w:tab w:val="num" w:pos="2880"/>
+        </w:tabs>
+        <w:ind w:left="2880" w:hanging="360"/>
+      </w:pPr>
+    </w:lvl>
+    <w:lvl w:ilvl="4" w:tentative="1">
+      <w:start w:val="1"/>
+      <w:numFmt w:val="decimal"/>
+      <w:lvlText w:val="%5."/>
+      <w:lvlJc w:val="left"/>
+      <w:pPr>
+        <w:tabs>
+          <w:tab w:val="num" w:pos="3600"/>
+        </w:tabs>
+        <w:ind w:left="3600" w:hanging="360"/>
+      </w:pPr>
+    </w:lvl>
+    <w:lvl w:ilvl="5" w:tentative="1">
+      <w:start w:val="1"/>
+      <w:numFmt w:val="decimal"/>
+      <w:lvlText w:val="%6."/>
+      <w:lvlJc w:val="left"/>
+      <w:pPr>
+        <w:tabs>
+          <w:tab w:val="num" w:pos="4320"/>
+        </w:tabs>
+        <w:ind w:left="4320" w:hanging="360"/>
+      </w:pPr>
+    </w:lvl>
+    <w:lvl w:ilvl="6" w:tentative="1">
+      <w:start w:val="1"/>
+      <w:numFmt w:val="decimal"/>
+      <w:lvlText w:val="%7."/>
+      <w:lvlJc w:val="left"/>
+      <w:pPr>
+        <w:tabs>
+          <w:tab w:val="num" w:pos="5040"/>
+        </w:tabs>
+        <w:ind w:left="5040" w:hanging="360"/>
+      </w:pPr>
+    </w:lvl>
+    <w:lvl w:ilvl="7" w:tentative="1">
+      <w:start w:val="1"/>
+      <w:numFmt w:val="decimal"/>
+      <w:lvlText w:val="%8."/>
+      <w:lvlJc w:val="left"/>
+      <w:pPr>
+        <w:tabs>
+          <w:tab w:val="num" w:pos="5760"/>
+        </w:tabs>
+        <w:ind w:left="5760" w:hanging="360"/>
+      </w:pPr>
+    </w:lvl>
+    <w:lvl w:ilvl="8" w:tentative="1">
+      <w:start w:val="1"/>
+      <w:numFmt w:val="decimal"/>
+      <w:lvlText w:val="%9."/>
+      <w:lvlJc w:val="left"/>
+      <w:pPr>
+        <w:tabs>
+          <w:tab w:val="num" w:pos="6480"/>
+        </w:tabs>
+        <w:ind w:left="6480" w:hanging="360"/>
+      </w:pPr>
+    </w:lvl>
+  </w:abstractNum>
+  <w:abstractNum w:abstractNumId="5" w15:restartNumberingAfterBreak="0">
     <w:nsid w:val="5BAF0560"/>
     <w:multiLevelType w:val="multilevel"/>
     <w:tmpl w:val="DB6EC78A"/>
@@ -13436,7 +13664,7 @@
       </w:rPr>
     </w:lvl>
   </w:abstractNum>
-  <w:abstractNum w:abstractNumId="4" w15:restartNumberingAfterBreak="0">
+  <w:abstractNum w:abstractNumId="6" w15:restartNumberingAfterBreak="0">
     <w:nsid w:val="677837C8"/>
     <w:multiLevelType w:val="hybridMultilevel"/>
     <w:tmpl w:val="2688BC1A"/>
@@ -13525,7 +13753,7 @@
       </w:pPr>
     </w:lvl>
   </w:abstractNum>
-  <w:abstractNum w:abstractNumId="5" w15:restartNumberingAfterBreak="0">
+  <w:abstractNum w:abstractNumId="7" w15:restartNumberingAfterBreak="0">
     <w:nsid w:val="75CF5E05"/>
     <w:multiLevelType w:val="hybridMultilevel"/>
     <w:tmpl w:val="6C72C336"/>
@@ -13611,7 +13839,7 @@
       </w:pPr>
     </w:lvl>
   </w:abstractNum>
-  <w:abstractNum w:abstractNumId="6" w15:restartNumberingAfterBreak="0">
+  <w:abstractNum w:abstractNumId="8" w15:restartNumberingAfterBreak="0">
     <w:nsid w:val="7A79455B"/>
     <w:multiLevelType w:val="hybridMultilevel"/>
     <w:tmpl w:val="33A228CA"/>
@@ -13725,25 +13953,31 @@
     </w:lvl>
   </w:abstractNum>
   <w:num w:numId="1" w16cid:durableId="1138374776">
-    <w:abstractNumId w:val="4"/>
+    <w:abstractNumId w:val="6"/>
   </w:num>
   <w:num w:numId="2" w16cid:durableId="615337121">
-    <w:abstractNumId w:val="5"/>
+    <w:abstractNumId w:val="7"/>
   </w:num>
   <w:num w:numId="3" w16cid:durableId="52512146">
     <w:abstractNumId w:val="0"/>
   </w:num>
   <w:num w:numId="4" w16cid:durableId="379523177">
-    <w:abstractNumId w:val="2"/>
+    <w:abstractNumId w:val="3"/>
   </w:num>
   <w:num w:numId="5" w16cid:durableId="1388917945">
-    <w:abstractNumId w:val="3"/>
+    <w:abstractNumId w:val="5"/>
   </w:num>
   <w:num w:numId="6" w16cid:durableId="1241719809">
-    <w:abstractNumId w:val="6"/>
+    <w:abstractNumId w:val="8"/>
   </w:num>
   <w:num w:numId="7" w16cid:durableId="1500384366">
     <w:abstractNumId w:val="1"/>
+  </w:num>
+  <w:num w:numId="8" w16cid:durableId="3480737">
+    <w:abstractNumId w:val="2"/>
+  </w:num>
+  <w:num w:numId="9" w16cid:durableId="685520266">
+    <w:abstractNumId w:val="4"/>
   </w:num>
 </w:numbering>
 </file>
@@ -14351,7 +14585,6 @@
   <w:style w:type="character" w:default="1" w:styleId="DefaultParagraphFont">
     <w:name w:val="Default Paragraph Font"/>
     <w:uiPriority w:val="1"/>
-    <w:semiHidden/>
     <w:unhideWhenUsed/>
   </w:style>
   <w:style w:type="table" w:default="1" w:styleId="TableNormal">
@@ -14707,6 +14940,62 @@
       <w:shd w:val="clear" w:color="auto" w:fill="E1DFDD"/>
     </w:rPr>
   </w:style>
+  <w:style w:type="character" w:styleId="FollowedHyperlink">
+    <w:name w:val="FollowedHyperlink"/>
+    <w:basedOn w:val="DefaultParagraphFont"/>
+    <w:uiPriority w:val="99"/>
+    <w:semiHidden/>
+    <w:unhideWhenUsed/>
+    <w:rsid w:val="00626ADB"/>
+    <w:rPr>
+      <w:color w:val="96607D" w:themeColor="followedHyperlink"/>
+      <w:u w:val="single"/>
+    </w:rPr>
+  </w:style>
+  <w:style w:type="paragraph" w:styleId="Header">
+    <w:name w:val="header"/>
+    <w:basedOn w:val="Normal"/>
+    <w:link w:val="HeaderChar"/>
+    <w:uiPriority w:val="99"/>
+    <w:unhideWhenUsed/>
+    <w:rsid w:val="002F44AE"/>
+    <w:pPr>
+      <w:tabs>
+        <w:tab w:val="center" w:pos="4680"/>
+        <w:tab w:val="right" w:pos="9360"/>
+      </w:tabs>
+      <w:spacing w:after="0" w:line="240" w:lineRule="auto"/>
+    </w:pPr>
+  </w:style>
+  <w:style w:type="character" w:customStyle="1" w:styleId="HeaderChar">
+    <w:name w:val="Header Char"/>
+    <w:basedOn w:val="DefaultParagraphFont"/>
+    <w:link w:val="Header"/>
+    <w:uiPriority w:val="99"/>
+    <w:rsid w:val="002F44AE"/>
+  </w:style>
+  <w:style w:type="paragraph" w:styleId="Footer">
+    <w:name w:val="footer"/>
+    <w:basedOn w:val="Normal"/>
+    <w:link w:val="FooterChar"/>
+    <w:uiPriority w:val="99"/>
+    <w:unhideWhenUsed/>
+    <w:rsid w:val="002F44AE"/>
+    <w:pPr>
+      <w:tabs>
+        <w:tab w:val="center" w:pos="4680"/>
+        <w:tab w:val="right" w:pos="9360"/>
+      </w:tabs>
+      <w:spacing w:after="0" w:line="240" w:lineRule="auto"/>
+    </w:pPr>
+  </w:style>
+  <w:style w:type="character" w:customStyle="1" w:styleId="FooterChar">
+    <w:name w:val="Footer Char"/>
+    <w:basedOn w:val="DefaultParagraphFont"/>
+    <w:link w:val="Footer"/>
+    <w:uiPriority w:val="99"/>
+    <w:rsid w:val="002F44AE"/>
+  </w:style>
 </w:styles>
 </file>
 

</xml_diff>